<commit_message>
Update resume GPA 3.98 -> 4.0 (docx + served PDF)
Co-Authored-By: Claude Fable 5 <noreply@anthropic.com>
</commit_message>
<xml_diff>
--- a/Resume/Jordan_Heaton_Resume.docx
+++ b/Resume/Jordan_Heaton_Resume.docx
@@ -41,7 +41,39 @@
           <w:color w:val="5A5A5A"/>
           <w:sz w:val="19"/>
         </w:rPr>
-        <w:t>Orem, UT  ·  (801) 228-0653  ·  jordandheaton@gmail.com  ·  linkedin.com/in/jordan-heaton  ·  jordandheaton.github.io</w:t>
+        <w:t>Orem, UT  ·  (8</w:t>
+      </w:r>
+      <w:r>
+        <w:rPr>
+          <w:rFonts w:ascii="Calibri" w:hAnsi="Calibri"/>
+          <w:color w:val="5A5A5A"/>
+          <w:sz w:val="19"/>
+        </w:rPr>
+        <w:t>0</w:t>
+      </w:r>
+      <w:r>
+        <w:rPr>
+          <w:rFonts w:ascii="Calibri" w:hAnsi="Calibri"/>
+          <w:color w:val="5A5A5A"/>
+          <w:sz w:val="19"/>
+        </w:rPr>
+        <w:t>1) 228-</w:t>
+      </w:r>
+      <w:r>
+        <w:rPr>
+          <w:rFonts w:ascii="Calibri" w:hAnsi="Calibri"/>
+          <w:color w:val="5A5A5A"/>
+          <w:sz w:val="19"/>
+        </w:rPr>
+        <w:t>0</w:t>
+      </w:r>
+      <w:r>
+        <w:rPr>
+          <w:rFonts w:ascii="Calibri" w:hAnsi="Calibri"/>
+          <w:color w:val="5A5A5A"/>
+          <w:sz w:val="19"/>
+        </w:rPr>
+        <w:t>653  ·  jordandheaton@gmail.com  ·  linkedin.com/in/jordan-heaton  ·  jordandheaton.github.io</w:t>
       </w:r>
     </w:p>
     <w:p>
@@ -139,7 +171,34 @@
           <w:sz w:val="21"/>
         </w:rPr>
         <w:tab/>
-        <w:t>Expected Apr 2030</w:t>
+        <w:t>Expected Apr 2</w:t>
+      </w:r>
+      <w:r>
+        <w:rPr>
+          <w:rFonts w:ascii="Calibri" w:hAnsi="Calibri" w:cs="Calibri"/>
+          <w:i/>
+          <w:color w:val="5A5A5A"/>
+          <w:sz w:val="21"/>
+        </w:rPr>
+        <w:t>0</w:t>
+      </w:r>
+      <w:r>
+        <w:rPr>
+          <w:rFonts w:ascii="Calibri" w:hAnsi="Calibri" w:cs="Calibri"/>
+          <w:i/>
+          <w:color w:val="5A5A5A"/>
+          <w:sz w:val="21"/>
+        </w:rPr>
+        <w:t>3</w:t>
+      </w:r>
+      <w:r>
+        <w:rPr>
+          <w:rFonts w:ascii="Calibri" w:hAnsi="Calibri" w:cs="Calibri"/>
+          <w:i/>
+          <w:color w:val="5A5A5A"/>
+          <w:sz w:val="21"/>
+        </w:rPr>
+        <w:t>0</w:t>
       </w:r>
     </w:p>
     <w:p>
@@ -158,7 +217,25 @@
           <w:color w:val="5A5A5A"/>
           <w:sz w:val="20"/>
         </w:rPr>
-        <w:t>B.S., Information Systems (pre-application)   ·   GPA 3.98   ·   BYU High Honor Roll</w:t>
+        <w:t xml:space="preserve">B.S., Information Systems (pre-application)   ·   GPA </w:t>
+      </w:r>
+      <w:r>
+        <w:rPr>
+          <w:rFonts w:ascii="Calibri" w:hAnsi="Calibri" w:cs="Calibri"/>
+          <w:i/>
+          <w:color w:val="5A5A5A"/>
+          <w:sz w:val="20"/>
+        </w:rPr>
+        <w:t>4.0</w:t>
+      </w:r>
+      <w:r>
+        <w:rPr>
+          <w:rFonts w:ascii="Calibri" w:hAnsi="Calibri" w:cs="Calibri"/>
+          <w:i/>
+          <w:color w:val="5A5A5A"/>
+          <w:sz w:val="20"/>
+        </w:rPr>
+        <w:t xml:space="preserve">   ·   BYU High Honor Roll</w:t>
       </w:r>
     </w:p>
     <w:p>
@@ -176,7 +253,39 @@
           <w:color w:val="000000"/>
           <w:sz w:val="20"/>
         </w:rPr>
-        <w:t>Relevant Coursework: Introduction to Information Systems (IS 201), Spreadsheets &amp; Business Analysis (IS 110), Financial &amp; Managerial Accounting, Statistics, Economics</w:t>
+        <w:t>Relevant Coursework: Introduction to Information Systems (IS 2</w:t>
+      </w:r>
+      <w:r>
+        <w:rPr>
+          <w:rFonts w:ascii="Calibri" w:hAnsi="Calibri" w:cs="Calibri"/>
+          <w:color w:val="000000"/>
+          <w:sz w:val="20"/>
+        </w:rPr>
+        <w:t>0</w:t>
+      </w:r>
+      <w:r>
+        <w:rPr>
+          <w:rFonts w:ascii="Calibri" w:hAnsi="Calibri" w:cs="Calibri"/>
+          <w:color w:val="000000"/>
+          <w:sz w:val="20"/>
+        </w:rPr>
+        <w:t>1), Spreadsheets &amp; Business Analysis (IS 11</w:t>
+      </w:r>
+      <w:r>
+        <w:rPr>
+          <w:rFonts w:ascii="Calibri" w:hAnsi="Calibri" w:cs="Calibri"/>
+          <w:color w:val="000000"/>
+          <w:sz w:val="20"/>
+        </w:rPr>
+        <w:t>0</w:t>
+      </w:r>
+      <w:r>
+        <w:rPr>
+          <w:rFonts w:ascii="Calibri" w:hAnsi="Calibri" w:cs="Calibri"/>
+          <w:color w:val="000000"/>
+          <w:sz w:val="20"/>
+        </w:rPr>
+        <w:t>), Financial &amp; Managerial Accounting, Statistics, Economics</w:t>
       </w:r>
     </w:p>
     <w:p>
@@ -254,7 +363,43 @@
           <w:sz w:val="21"/>
         </w:rPr>
         <w:tab/>
-        <w:t>Aug 2019 – May 2023</w:t>
+        <w:t>Aug 2</w:t>
+      </w:r>
+      <w:r>
+        <w:rPr>
+          <w:rFonts w:ascii="Calibri" w:hAnsi="Calibri" w:cs="Calibri"/>
+          <w:i/>
+          <w:color w:val="5A5A5A"/>
+          <w:sz w:val="21"/>
+        </w:rPr>
+        <w:t>0</w:t>
+      </w:r>
+      <w:r>
+        <w:rPr>
+          <w:rFonts w:ascii="Calibri" w:hAnsi="Calibri" w:cs="Calibri"/>
+          <w:i/>
+          <w:color w:val="5A5A5A"/>
+          <w:sz w:val="21"/>
+        </w:rPr>
+        <w:t>19 – May 2</w:t>
+      </w:r>
+      <w:r>
+        <w:rPr>
+          <w:rFonts w:ascii="Calibri" w:hAnsi="Calibri" w:cs="Calibri"/>
+          <w:i/>
+          <w:color w:val="5A5A5A"/>
+          <w:sz w:val="21"/>
+        </w:rPr>
+        <w:t>0</w:t>
+      </w:r>
+      <w:r>
+        <w:rPr>
+          <w:rFonts w:ascii="Calibri" w:hAnsi="Calibri" w:cs="Calibri"/>
+          <w:i/>
+          <w:color w:val="5A5A5A"/>
+          <w:sz w:val="21"/>
+        </w:rPr>
+        <w:t>23</w:t>
       </w:r>
     </w:p>
     <w:p>
@@ -496,7 +641,25 @@
           <w:sz w:val="21"/>
         </w:rPr>
         <w:tab/>
-        <w:t>July 2025</w:t>
+        <w:t>July 2</w:t>
+      </w:r>
+      <w:r>
+        <w:rPr>
+          <w:rFonts w:ascii="Calibri" w:hAnsi="Calibri" w:cs="Calibri"/>
+          <w:i/>
+          <w:color w:val="5A5A5A"/>
+          <w:sz w:val="21"/>
+        </w:rPr>
+        <w:t>0</w:t>
+      </w:r>
+      <w:r>
+        <w:rPr>
+          <w:rFonts w:ascii="Calibri" w:hAnsi="Calibri" w:cs="Calibri"/>
+          <w:i/>
+          <w:color w:val="5A5A5A"/>
+          <w:sz w:val="21"/>
+        </w:rPr>
+        <w:t>25</w:t>
       </w:r>
     </w:p>
     <w:p>
@@ -519,7 +682,23 @@
           <w:color w:val="000000"/>
           <w:sz w:val="20"/>
         </w:rPr>
-        <w:t>Designed and built an AI-powered web app that matches BYU students to scholarships across all 10 colleges, tracks deadlines, and generates personalized application strategies.</w:t>
+        <w:t>Designed and built an AI-powered web app that matches BYU students to scholarships across all 1</w:t>
+      </w:r>
+      <w:r>
+        <w:rPr>
+          <w:rFonts w:ascii="Calibri" w:hAnsi="Calibri" w:cs="Calibri"/>
+          <w:color w:val="000000"/>
+          <w:sz w:val="20"/>
+        </w:rPr>
+        <w:t>0</w:t>
+      </w:r>
+      <w:r>
+        <w:rPr>
+          <w:rFonts w:ascii="Calibri" w:hAnsi="Calibri" w:cs="Calibri"/>
+          <w:color w:val="000000"/>
+          <w:sz w:val="20"/>
+        </w:rPr>
+        <w:t xml:space="preserve"> colleges, tracks deadlines, and generates personalized application strategies.</w:t>
       </w:r>
     </w:p>
     <w:p>
@@ -574,7 +753,25 @@
           <w:sz w:val="21"/>
         </w:rPr>
         <w:tab/>
-        <w:t>June 2025</w:t>
+        <w:t>June 2</w:t>
+      </w:r>
+      <w:r>
+        <w:rPr>
+          <w:rFonts w:ascii="Calibri" w:hAnsi="Calibri" w:cs="Calibri"/>
+          <w:i/>
+          <w:color w:val="5A5A5A"/>
+          <w:sz w:val="21"/>
+        </w:rPr>
+        <w:t>0</w:t>
+      </w:r>
+      <w:r>
+        <w:rPr>
+          <w:rFonts w:ascii="Calibri" w:hAnsi="Calibri" w:cs="Calibri"/>
+          <w:i/>
+          <w:color w:val="5A5A5A"/>
+          <w:sz w:val="21"/>
+        </w:rPr>
+        <w:t>25</w:t>
       </w:r>
     </w:p>
     <w:p>
@@ -676,7 +873,43 @@
           <w:sz w:val="21"/>
         </w:rPr>
         <w:tab/>
-        <w:t>Sep 2023 – Apr 2024</w:t>
+        <w:t>Sep 2</w:t>
+      </w:r>
+      <w:r>
+        <w:rPr>
+          <w:rFonts w:ascii="Calibri" w:hAnsi="Calibri" w:cs="Calibri"/>
+          <w:i/>
+          <w:color w:val="5A5A5A"/>
+          <w:sz w:val="21"/>
+        </w:rPr>
+        <w:t>0</w:t>
+      </w:r>
+      <w:r>
+        <w:rPr>
+          <w:rFonts w:ascii="Calibri" w:hAnsi="Calibri" w:cs="Calibri"/>
+          <w:i/>
+          <w:color w:val="5A5A5A"/>
+          <w:sz w:val="21"/>
+        </w:rPr>
+        <w:t>23 – Apr 2</w:t>
+      </w:r>
+      <w:r>
+        <w:rPr>
+          <w:rFonts w:ascii="Calibri" w:hAnsi="Calibri" w:cs="Calibri"/>
+          <w:i/>
+          <w:color w:val="5A5A5A"/>
+          <w:sz w:val="21"/>
+        </w:rPr>
+        <w:t>0</w:t>
+      </w:r>
+      <w:r>
+        <w:rPr>
+          <w:rFonts w:ascii="Calibri" w:hAnsi="Calibri" w:cs="Calibri"/>
+          <w:i/>
+          <w:color w:val="5A5A5A"/>
+          <w:sz w:val="21"/>
+        </w:rPr>
+        <w:t>24</w:t>
       </w:r>
     </w:p>
     <w:p>
@@ -699,7 +932,23 @@
           <w:color w:val="000000"/>
           <w:sz w:val="20"/>
         </w:rPr>
-        <w:t>Coordinated ticketing, seating accommodations, and parking logistics for 50+ campus events, keeping high-traffic venues running smoothly.</w:t>
+        <w:t>Coordinated ticketing, seating accommodations, and parking logistics for 5</w:t>
+      </w:r>
+      <w:r>
+        <w:rPr>
+          <w:rFonts w:ascii="Calibri" w:hAnsi="Calibri" w:cs="Calibri"/>
+          <w:color w:val="000000"/>
+          <w:sz w:val="20"/>
+        </w:rPr>
+        <w:t>0</w:t>
+      </w:r>
+      <w:r>
+        <w:rPr>
+          <w:rFonts w:ascii="Calibri" w:hAnsi="Calibri" w:cs="Calibri"/>
+          <w:color w:val="000000"/>
+          <w:sz w:val="20"/>
+        </w:rPr>
+        <w:t>+ campus events, keeping high-traffic venues running smoothly.</w:t>
       </w:r>
     </w:p>
     <w:p>
@@ -754,7 +1003,25 @@
           <w:sz w:val="21"/>
         </w:rPr>
         <w:tab/>
-        <w:t>Summer 2019</w:t>
+        <w:t>Summer 2</w:t>
+      </w:r>
+      <w:r>
+        <w:rPr>
+          <w:rFonts w:ascii="Calibri" w:hAnsi="Calibri" w:cs="Calibri"/>
+          <w:i/>
+          <w:color w:val="5A5A5A"/>
+          <w:sz w:val="21"/>
+        </w:rPr>
+        <w:t>0</w:t>
+      </w:r>
+      <w:r>
+        <w:rPr>
+          <w:rFonts w:ascii="Calibri" w:hAnsi="Calibri" w:cs="Calibri"/>
+          <w:i/>
+          <w:color w:val="5A5A5A"/>
+          <w:sz w:val="21"/>
+        </w:rPr>
+        <w:t>19</w:t>
       </w:r>
     </w:p>
     <w:p>
@@ -777,7 +1044,23 @@
           <w:color w:val="000000"/>
           <w:sz w:val="20"/>
         </w:rPr>
-        <w:t>Served 400+ guests during peak events while sustaining fast, consistent food preparation and quality.</w:t>
+        <w:t>Served 4</w:t>
+      </w:r>
+      <w:r>
+        <w:rPr>
+          <w:rFonts w:ascii="Calibri" w:hAnsi="Calibri" w:cs="Calibri"/>
+          <w:color w:val="000000"/>
+          <w:sz w:val="20"/>
+        </w:rPr>
+        <w:t>00</w:t>
+      </w:r>
+      <w:r>
+        <w:rPr>
+          <w:rFonts w:ascii="Calibri" w:hAnsi="Calibri" w:cs="Calibri"/>
+          <w:color w:val="000000"/>
+          <w:sz w:val="20"/>
+        </w:rPr>
+        <w:t>+ guests during peak events while sustaining fast, consistent food preparation and quality.</w:t>
       </w:r>
     </w:p>
     <w:p>
@@ -856,7 +1139,43 @@
           <w:sz w:val="21"/>
         </w:rPr>
         <w:tab/>
-        <w:t>May 2024 – Feb 2026</w:t>
+        <w:t>May 2</w:t>
+      </w:r>
+      <w:r>
+        <w:rPr>
+          <w:rFonts w:ascii="Calibri" w:hAnsi="Calibri" w:cs="Calibri"/>
+          <w:i/>
+          <w:color w:val="5A5A5A"/>
+          <w:sz w:val="21"/>
+        </w:rPr>
+        <w:t>0</w:t>
+      </w:r>
+      <w:r>
+        <w:rPr>
+          <w:rFonts w:ascii="Calibri" w:hAnsi="Calibri" w:cs="Calibri"/>
+          <w:i/>
+          <w:color w:val="5A5A5A"/>
+          <w:sz w:val="21"/>
+        </w:rPr>
+        <w:t>24 – Feb 2</w:t>
+      </w:r>
+      <w:r>
+        <w:rPr>
+          <w:rFonts w:ascii="Calibri" w:hAnsi="Calibri" w:cs="Calibri"/>
+          <w:i/>
+          <w:color w:val="5A5A5A"/>
+          <w:sz w:val="21"/>
+        </w:rPr>
+        <w:t>0</w:t>
+      </w:r>
+      <w:r>
+        <w:rPr>
+          <w:rFonts w:ascii="Calibri" w:hAnsi="Calibri" w:cs="Calibri"/>
+          <w:i/>
+          <w:color w:val="5A5A5A"/>
+          <w:sz w:val="21"/>
+        </w:rPr>
+        <w:t>26</w:t>
       </w:r>
     </w:p>
     <w:p>
@@ -879,7 +1198,23 @@
           <w:color w:val="000000"/>
           <w:sz w:val="20"/>
         </w:rPr>
-        <w:t>Directed community outreach, training, and localized logistics as a regional coordinator supporting 20+ volunteers.</w:t>
+        <w:t>Directed community outreach, training, and localized logistics as a regional coordinator supporting 2</w:t>
+      </w:r>
+      <w:r>
+        <w:rPr>
+          <w:rFonts w:ascii="Calibri" w:hAnsi="Calibri" w:cs="Calibri"/>
+          <w:color w:val="000000"/>
+          <w:sz w:val="20"/>
+        </w:rPr>
+        <w:t>0</w:t>
+      </w:r>
+      <w:r>
+        <w:rPr>
+          <w:rFonts w:ascii="Calibri" w:hAnsi="Calibri" w:cs="Calibri"/>
+          <w:color w:val="000000"/>
+          <w:sz w:val="20"/>
+        </w:rPr>
+        <w:t>+ volunteers.</w:t>
       </w:r>
     </w:p>
     <w:p>
@@ -934,7 +1269,25 @@
           <w:sz w:val="21"/>
         </w:rPr>
         <w:tab/>
-        <w:t>Apr 2023</w:t>
+        <w:t>Apr 2</w:t>
+      </w:r>
+      <w:r>
+        <w:rPr>
+          <w:rFonts w:ascii="Calibri" w:hAnsi="Calibri" w:cs="Calibri"/>
+          <w:i/>
+          <w:color w:val="5A5A5A"/>
+          <w:sz w:val="21"/>
+        </w:rPr>
+        <w:t>0</w:t>
+      </w:r>
+      <w:r>
+        <w:rPr>
+          <w:rFonts w:ascii="Calibri" w:hAnsi="Calibri" w:cs="Calibri"/>
+          <w:i/>
+          <w:color w:val="5A5A5A"/>
+          <w:sz w:val="21"/>
+        </w:rPr>
+        <w:t>23</w:t>
       </w:r>
     </w:p>
     <w:p>
@@ -957,7 +1310,23 @@
           <w:color w:val="000000"/>
           <w:sz w:val="20"/>
         </w:rPr>
-        <w:t>Assisted 50+ children across 4 Guatemalan communities by monitoring nutritional health and supporting education and healthcare initiatives during a two-week service project.</w:t>
+        <w:t>Assisted 5</w:t>
+      </w:r>
+      <w:r>
+        <w:rPr>
+          <w:rFonts w:ascii="Calibri" w:hAnsi="Calibri" w:cs="Calibri"/>
+          <w:color w:val="000000"/>
+          <w:sz w:val="20"/>
+        </w:rPr>
+        <w:t>0</w:t>
+      </w:r>
+      <w:r>
+        <w:rPr>
+          <w:rFonts w:ascii="Calibri" w:hAnsi="Calibri" w:cs="Calibri"/>
+          <w:color w:val="000000"/>
+          <w:sz w:val="20"/>
+        </w:rPr>
+        <w:t>+ children across 4 Guatemalan communities by monitoring nutritional health and supporting education and healthcare initiatives during a two-week service project.</w:t>
       </w:r>
     </w:p>
     <w:p>
@@ -1050,7 +1419,23 @@
           <w:color w:val="000000"/>
           <w:sz w:val="20"/>
         </w:rPr>
-        <w:t>BYU High Honor Roll – maintained a 3.98 cumulative GPA in a rigorous curriculum.</w:t>
+        <w:t xml:space="preserve">BYU High Honor Roll – maintained a </w:t>
+      </w:r>
+      <w:r>
+        <w:rPr>
+          <w:rFonts w:ascii="Calibri" w:hAnsi="Calibri" w:cs="Calibri"/>
+          <w:color w:val="000000"/>
+          <w:sz w:val="20"/>
+        </w:rPr>
+        <w:t>4.0</w:t>
+      </w:r>
+      <w:r>
+        <w:rPr>
+          <w:rFonts w:ascii="Calibri" w:hAnsi="Calibri" w:cs="Calibri"/>
+          <w:color w:val="000000"/>
+          <w:sz w:val="20"/>
+        </w:rPr>
+        <w:t xml:space="preserve"> cumulative GPA in a rigorous curriculum.</w:t>
       </w:r>
     </w:p>
     <w:p>

</xml_diff>